<commit_message>
SQB 2024 yillik MHXS hisoboti qo‘shildi va tekshirildi; maqola metodologiyasi to‘ldirildi
Co-Authored-By: Claude Opus 5.5 <noreply@anthropic.com>
Claude-Session: https://claude.ai/code/session_01PxHTC8Q7yHdrpAeUA5KUgM
</commit_message>
<xml_diff>
--- a/Maqola_SQB_milliy_va_MHXS9.docx
+++ b/Maqola_SQB_milliy_va_MHXS9.docx
@@ -139,7 +139,7 @@
           <w:i w:val="0"/>
           <w:sz w:val="26"/>
         </w:rPr>
-        <w:t>Tadqiqotda “O‘zsanoatqurilishbank” ATB ning 2023-yil (2021–2023-yillar ma’lumotlari bilan) va 2025-yil (2024–2025-yillar) uchun auditdan o‘tgan konsolidatsiyalangan moliyaviy hisobotlari [7; 8] hamda bankning milliy hisobot ma’lumotlari [9] qo‘llandi. Hisobotlarda amortizatsiyalangan qiymatda baholanadigan mijozlarga kreditlar uch segment (korporativ, davlat va munitsipal tashkilotlar, jismoniy shaxslar) bo‘yicha MHXS 9 bosqichlari va Markaziy bank tasnifi toifalari kesimida (kesishma jadval), shuningdek bosqichlararo o‘tishlar bilan oshkor qilingan. Segmentlar ma’lumotlari yig‘ilib, bank bo‘yicha jami ko‘rsatkichlar hisoblandi. Bosqichlarni belgilash mezonlari bankning hisob siyosatidan, milliy tasnif mezonlari Markaziy bank nizomi [10] va toifalar ta’riflaridan olindi.</w:t>
+        <w:t>Tadqiqotda “O‘zsanoatqurilishbank” ATB ning 2023-yil (2021–2023-yillar ma’lumotlari bilan) va 2025-yil (2024–2025-yillar) uchun auditdan o‘tgan konsolidatsiyalangan moliyaviy hisobotlari [7; 8] hamda bankning milliy hisobot ma’lumotlari [9] qo‘llandi. Har bir yil uchun ushbu yilni qamragan eng so‘nggi hisobot olindi, chunki unda oldingi yillar ma’lumotlari qayta hisoblangan: bank 2023-yilda 2021–2023-yillarni qamragan uch yillik hisobot e’lon qilib, 2021–2022-yillar ma’lumotlarini qayta hisoblagan. Ma’lumotlarning izchilligi 2024-yil uchun hisobot [11] bilan tekshirildi: undagi 2023 va 2024-yillar kesishma jadvallari va bosqichlararo o‘tishlar tanlangan hisobotlardagi qiymatlarga to‘liq mos keladi. Hisobotlarda amortizatsiyalangan qiymatda baholanadigan mijozlarga kreditlar uch segment (korporativ, davlat va munitsipal tashkilotlar, jismoniy shaxslar) bo‘yicha MHXS 9 bosqichlari va Markaziy bank tasnifi toifalari kesimida (kesishma jadval), shuningdek bosqichlararo o‘tishlar bilan oshkor qilingan. Segmentlar ma’lumotlari yig‘ilib, bank bo‘yicha jami ko‘rsatkichlar hisoblandi. Bosqichlarni belgilash mezonlari bankning hisob siyosatidan, milliy tasnif mezonlari Markaziy bank nizomi [10] va toifalar ta’riflaridan olindi.</w:t>
       </w:r>
     </w:p>
     <w:p>
@@ -5550,6 +5550,21 @@
         <w:t>10. Tijorat banklarida aktivlar sifatini tasniflash va aktivlar bo‘yicha ehtimoliy yo‘qotishlarni qoplash uchun zaxiralarni shakllantirish hamda ulardan foydalanish tartibi to‘g‘risidagi nizom (O‘zbekiston Respublikasi Markaziy banki Boshqaruvining qarori, ro‘yxat raqami 2696, 14.07.2015) // https://lex.uz.</w:t>
       </w:r>
     </w:p>
+    <w:p>
+      <w:pPr>
+        <w:spacing w:line="240" w:lineRule="auto"/>
+        <w:ind w:firstLine="0"/>
+        <w:jc w:val="both"/>
+      </w:pPr>
+      <w:r>
+        <w:rPr>
+          <w:b w:val="0"/>
+          <w:i w:val="0"/>
+          <w:sz w:val="24"/>
+        </w:rPr>
+        <w:t>11. JSCB “Uzbek Industrial and Construction Bank” and its Subsidiaries. Consolidated Financial Statements and Independent Auditor’s Report for the Year Ended 31 December 2024. – Tashkent, 2025. – https://sqb.uz.</w:t>
+      </w:r>
+    </w:p>
     <w:sectPr>
       <w:pgSz w:w="11906" w:h="16838"/>
       <w:pgMar w:top="1134" w:right="1134" w:bottom="1134" w:left="1417" w:header="720" w:footer="720" w:gutter="0"/>

</xml_diff>